<commit_message>
Netinho: revisão da Parte 5
Co-Authored-By: Claude Opus 5.5 <noreply@anthropic.com>
Claude-Session: https://claude.ai/code/session_01MJjUEEZrxQDEUifKK2vj9g
</commit_message>
<xml_diff>
--- a/roteiros/netinho/Netinho_Parte5.docx
+++ b/roteiros/netinho/Netinho_Parte5.docx
@@ -79,7 +79,7 @@
         <w:rPr>
           <w:color w:val="000000"/>
         </w:rPr>
-        <w:t>O homem que nunca deixou o público sem notícia, de repente, ficou em silêncio.</w:t>
+        <w:t>O homem que tinha mostrado cada passo do tratamento, de repente, ficou em silêncio.</w:t>
       </w:r>
     </w:p>
     <w:p>
@@ -159,7 +159,7 @@
         <w:rPr>
           <w:color w:val="000000"/>
         </w:rPr>
-        <w:t>Treze anos depois, o corpo dele enfrentou de novo a mesma tempestade. Mas, dessa vez, não teve volta.</w:t>
+        <w:t>Treze anos depois, o corpo dele enfrentou de novo uma tempestade parecida. Mas, dessa vez, não teve volta.</w:t>
       </w:r>
     </w:p>
     <w:p>
@@ -167,7 +167,7 @@
         <w:rPr>
           <w:color w:val="000000"/>
         </w:rPr>
-        <w:t>E a nota terminava com uma frase simples. Uma frase que, para quem acompanhou a luta dele, diz muito.</w:t>
+        <w:t>E a nota trazia uma frase simples. Uma frase que, para quem acompanhou a luta dele, diz muito.</w:t>
       </w:r>
     </w:p>
     <w:p>
@@ -215,7 +215,7 @@
         <w:rPr>
           <w:color w:val="000000"/>
         </w:rPr>
-        <w:t>E repara numa coisa. O homem que passou a vida inteira em cima de trio elétrico, no meio de multidões, quis uma despedida longe delas. Segundo a nota, a pedido dele, o velório e a cremação foram reservados, só para a família e os amigos mais próximos.</w:t>
+        <w:t>E repara numa coisa. O homem que passou a vida inteira em cima de trio elétrico, no meio de multidões, quis uma despedida longe delas. Segundo a equipe dele, a pedido do próprio Netinho, o velório e a cremação foram reservados, só para a família e os amigos mais próximos.</w:t>
       </w:r>
     </w:p>
     <w:p>
@@ -399,7 +399,7 @@
         <w:rPr>
           <w:color w:val="000000"/>
         </w:rPr>
-        <w:t>O Netinho fez isso a vida inteira. Por amor aos fãs.</w:t>
+        <w:t>O Netinho fez isso muitas vezes, diante do Brasil inteiro. Por amor aos fãs.</w:t>
       </w:r>
     </w:p>
     <w:p>

</xml_diff>